<commit_message>
Update LED report: confirm 4 number boards and headlights out of scope
Co-Authored-By: Claude Opus 5.5 <noreply@anthropic.com>
Claude-Session: https://claude.ai/code/session_01SRofemskE9Ua3xffc2pfuH
</commit_message>
<xml_diff>
--- a/docs/iluminacion-led-74vcc/Memoria_Calculo_LED_74VCC_EMD.docx
+++ b/docs/iluminacion-led-74vcc/Memoria_Calculo_LED_74VCC_EMD.docx
@@ -493,7 +493,7 @@
           <w:color w:val="1F1E1D"/>
           <w:sz w:val="24"/>
         </w:rPr>
-        <w:t xml:space="preserve">Fuera de alcance: focos principales y luces de zanja (alta intensidad). No se resuelven </w:t>
+        <w:t xml:space="preserve">Fuera de alcance (confirmado): focos principales y luces de zanja de alta intensidad. </w:t>
       </w:r>
       <w:r>
         <w:rPr>
@@ -503,7 +503,7 @@
           <w:color w:val="1F1E1D"/>
           <w:sz w:val="24"/>
         </w:rPr>
-        <w:t xml:space="preserve">con tira LED; se recomienda lámpara LED PAR-56 de 74 VCC para uso ferroviario (ver </w:t>
+        <w:t xml:space="preserve">No se resuelven con tira LED; se recomienda lámpara LED PAR-56 de 74 VCC para uso </w:t>
       </w:r>
       <w:r>
         <w:rPr>
@@ -513,7 +513,7 @@
           <w:color w:val="1F1E1D"/>
           <w:sz w:val="24"/>
         </w:rPr>
-        <w:t>sección 8).</w:t>
+        <w:t>ferroviario (ver sección 8).</w:t>
       </w:r>
     </w:p>
     <w:p>
@@ -7998,7 +7998,7 @@
         <w:autoSpaceDN w:val="0"/>
         <w:autoSpaceDE w:val="0"/>
         <w:widowControl/>
-        <w:spacing w:line="276" w:lineRule="auto" w:before="216" w:after="0"/>
+        <w:spacing w:line="278" w:lineRule="auto" w:before="216" w:after="0"/>
         <w:ind w:left="180" w:right="288" w:firstLine="0"/>
         <w:jc w:val="left"/>
       </w:pPr>
@@ -8030,7 +8030,10 @@
           <w:color w:val="1F1E1D"/>
           <w:sz w:val="24"/>
         </w:rPr>
-        <w:t xml:space="preserve">de 74 V. Las longitudes y cantidades usadas son un inventario tipo: si en terreno difieren, </w:t>
+        <w:t xml:space="preserve">de 74 V. Las longitudes y cantidades usadas son un inventario tipo, salvo los 4 </w:t>
+      </w:r>
+      <w:r>
+        <w:br/>
       </w:r>
       <w:r>
         <w:rPr>
@@ -8040,7 +8043,17 @@
           <w:color w:val="1F1E1D"/>
           <w:sz w:val="24"/>
         </w:rPr>
-        <w:t>se recalcula con las mismas fórmulas.</w:t>
+        <w:t xml:space="preserve">numeradores por locomotora (2 por extremo), ya confirmados: si en terreno difieren, se </w:t>
+      </w:r>
+      <w:r>
+        <w:rPr>
+          <w:rFonts w:ascii="Anthropic Sans Print" w:hAnsi="Anthropic Sans Print" w:eastAsia="Anthropic Sans Print"/>
+          <w:b w:val="0"/>
+          <w:i w:val="0"/>
+          <w:color w:val="1F1E1D"/>
+          <w:sz w:val="24"/>
+        </w:rPr>
+        <w:t>recalcula con las mismas fórmulas.</w:t>
       </w:r>
     </w:p>
     <w:p>
@@ -8275,7 +8288,7 @@
         <w:autoSpaceDN w:val="0"/>
         <w:autoSpaceDE w:val="0"/>
         <w:widowControl/>
-        <w:spacing w:line="240" w:lineRule="auto" w:before="1566" w:after="0"/>
+        <w:spacing w:line="240" w:lineRule="auto" w:before="1206" w:after="0"/>
         <w:ind w:left="0" w:right="28" w:firstLine="0"/>
         <w:jc w:val="right"/>
       </w:pPr>
@@ -13584,7 +13597,7 @@
                     <pic:cNvPicPr/>
                   </pic:nvPicPr>
                   <pic:blipFill>
-                    <a:blip r:embed="rId12"/>
+                    <a:blip r:embed="rId11"/>
                     <a:stretch>
                       <a:fillRect/>
                     </a:stretch>
@@ -13691,7 +13704,7 @@
                     <pic:cNvPicPr/>
                   </pic:nvPicPr>
                   <pic:blipFill>
-                    <a:blip r:embed="rId11"/>
+                    <a:blip r:embed="rId12"/>
                     <a:stretch>
                       <a:fillRect/>
                     </a:stretch>
@@ -13758,7 +13771,7 @@
                     <pic:cNvPicPr/>
                   </pic:nvPicPr>
                   <pic:blipFill>
-                    <a:blip r:embed="rId12"/>
+                    <a:blip r:embed="rId11"/>
                     <a:stretch>
                       <a:fillRect/>
                     </a:stretch>
@@ -23712,13 +23725,12 @@
       </w:tblGrid>
       <w:tr>
         <w:trPr>
-          <w:trHeight w:hRule="exact" w:val="2100"/>
+          <w:trHeight w:hRule="exact" w:val="810"/>
         </w:trPr>
         <w:tc>
           <w:tcPr>
             <w:tcW w:type="dxa" w:w="340"/>
             <w:tcBorders/>
-            <w:shd w:fill="ffffff"/>
             <w:tcMar>
               <w:start w:w="0" w:type="dxa"/>
               <w:end w:w="0" w:type="dxa"/>
@@ -23782,7 +23794,7 @@
             </w:tblGrid>
             <w:tr>
               <w:trPr>
-                <w:trHeight w:hRule="exact" w:val="166"/>
+                <w:trHeight w:hRule="exact" w:val="146"/>
               </w:trPr>
               <w:tc>
                 <w:tcPr>
@@ -23803,7 +23815,116 @@
               <w:autoSpaceDN w:val="0"/>
               <w:autoSpaceDE w:val="0"/>
               <w:widowControl/>
-              <w:spacing w:line="254" w:lineRule="exact" w:before="0" w:after="0"/>
+              <w:spacing w:line="14" w:lineRule="exact" w:before="0" w:after="0"/>
+              <w:ind w:left="0" w:right="0"/>
+            </w:pPr>
+          </w:p>
+          <w:p>
+            <w:pPr>
+              <w:autoSpaceDN w:val="0"/>
+              <w:autoSpaceDE w:val="0"/>
+              <w:widowControl/>
+              <w:spacing w:line="14" w:lineRule="exact" w:before="0" w:after="0"/>
+              <w:ind w:left="0" w:right="0"/>
+            </w:pPr>
+          </w:p>
+        </w:tc>
+        <w:tc>
+          <w:tcPr>
+            <w:tcW w:type="dxa" w:w="9920"/>
+            <w:tcBorders/>
+            <w:tcMar>
+              <w:start w:w="0" w:type="dxa"/>
+              <w:end w:w="0" w:type="dxa"/>
+            </w:tcMar>
+          </w:tcPr>
+          <w:p>
+            <w:pPr>
+              <w:autoSpaceDN w:val="0"/>
+              <w:autoSpaceDE w:val="0"/>
+              <w:widowControl/>
+              <w:spacing w:line="288" w:lineRule="auto" w:before="60" w:after="0"/>
+              <w:ind w:left="96" w:right="0" w:firstLine="0"/>
+              <w:jc w:val="left"/>
+            </w:pPr>
+            <w:r>
+              <w:rPr>
+                <w:rFonts w:ascii="Anthropic Sans Print" w:hAnsi="Anthropic Sans Print" w:eastAsia="Anthropic Sans Print"/>
+                <w:b w:val="0"/>
+                <w:i w:val="0"/>
+                <w:color w:val="1F1E1D"/>
+                <w:sz w:val="24"/>
+              </w:rPr>
+              <w:t xml:space="preserve">Modelo EMD de las unidades 49 y 50 </w:t>
+            </w:r>
+            <w:r>
+              <w:br/>
+            </w:r>
+            <w:r>
+              <w:rPr>
+                <w:rFonts w:ascii="Anthropic Sans Print" w:hAnsi="Anthropic Sans Print" w:eastAsia="Anthropic Sans Print"/>
+                <w:b w:val="0"/>
+                <w:i w:val="0"/>
+                <w:color w:val="1F1E1D"/>
+                <w:sz w:val="24"/>
+              </w:rPr>
+              <w:t>Inventario real de las demás luminarias (numeradores confirmados: 4) y potencia de las</w:t>
+            </w:r>
+          </w:p>
+        </w:tc>
+      </w:tr>
+    </w:tbl>
+    <w:p>
+      <w:pPr>
+        <w:autoSpaceDN w:val="0"/>
+        <w:autoSpaceDE w:val="0"/>
+        <w:widowControl/>
+        <w:spacing w:line="240" w:lineRule="auto" w:before="30" w:after="60"/>
+        <w:ind w:left="516" w:right="0" w:firstLine="0"/>
+        <w:jc w:val="left"/>
+      </w:pPr>
+      <w:r>
+        <w:rPr>
+          <w:rFonts w:ascii="Anthropic Sans Print" w:hAnsi="Anthropic Sans Print" w:eastAsia="Anthropic Sans Print"/>
+          <w:b w:val="0"/>
+          <w:i w:val="0"/>
+          <w:color w:val="1F1E1D"/>
+          <w:sz w:val="24"/>
+        </w:rPr>
+        <w:t>ampolletas actuales</w:t>
+      </w:r>
+    </w:p>
+    <w:tbl>
+      <w:tblPr>
+        <w:tblW w:type="auto" w:w="0"/>
+        <w:tblLayout w:type="fixed"/>
+        <w:tblLook w:firstColumn="1" w:firstRow="1" w:lastColumn="0" w:lastRow="0" w:noHBand="0" w:noVBand="1" w:val="04A0"/>
+        <w:tblInd w:w="80.0" w:type="dxa"/>
+      </w:tblPr>
+      <w:tblGrid>
+        <w:gridCol w:w="5230"/>
+        <w:gridCol w:w="5230"/>
+      </w:tblGrid>
+      <w:tr>
+        <w:trPr>
+          <w:trHeight w:hRule="exact" w:val="1260"/>
+        </w:trPr>
+        <w:tc>
+          <w:tcPr>
+            <w:tcW w:type="dxa" w:w="340"/>
+            <w:tcBorders/>
+            <w:shd w:fill="ffffff"/>
+            <w:tcMar>
+              <w:start w:w="0" w:type="dxa"/>
+              <w:end w:w="0" w:type="dxa"/>
+            </w:tcMar>
+          </w:tcPr>
+          <w:p>
+            <w:pPr>
+              <w:autoSpaceDN w:val="0"/>
+              <w:autoSpaceDE w:val="0"/>
+              <w:widowControl/>
+              <w:spacing w:line="126" w:lineRule="exact" w:before="0" w:after="0"/>
               <w:ind w:left="0" w:right="0"/>
             </w:pPr>
           </w:p>
@@ -23936,24 +24057,6 @@
               <w:ind w:left="0" w:right="0"/>
             </w:pPr>
           </w:p>
-          <w:p>
-            <w:pPr>
-              <w:autoSpaceDN w:val="0"/>
-              <w:autoSpaceDE w:val="0"/>
-              <w:widowControl/>
-              <w:spacing w:line="14" w:lineRule="exact" w:before="0" w:after="0"/>
-              <w:ind w:left="0" w:right="0"/>
-            </w:pPr>
-          </w:p>
-          <w:p>
-            <w:pPr>
-              <w:autoSpaceDN w:val="0"/>
-              <w:autoSpaceDE w:val="0"/>
-              <w:widowControl/>
-              <w:spacing w:line="14" w:lineRule="exact" w:before="0" w:after="0"/>
-              <w:ind w:left="0" w:right="0"/>
-            </w:pPr>
-          </w:p>
         </w:tc>
         <w:tc>
           <w:tcPr>
@@ -23970,36 +24073,10 @@
               <w:autoSpaceDN w:val="0"/>
               <w:autoSpaceDE w:val="0"/>
               <w:widowControl/>
-              <w:spacing w:line="317" w:lineRule="auto" w:before="60" w:after="0"/>
+              <w:spacing w:line="305" w:lineRule="auto" w:before="60" w:after="0"/>
               <w:ind w:left="96" w:right="576" w:firstLine="0"/>
               <w:jc w:val="left"/>
             </w:pPr>
-            <w:r>
-              <w:rPr>
-                <w:rFonts w:ascii="Anthropic Sans Print" w:hAnsi="Anthropic Sans Print" w:eastAsia="Anthropic Sans Print"/>
-                <w:b w:val="0"/>
-                <w:i w:val="0"/>
-                <w:color w:val="1F1E1D"/>
-                <w:sz w:val="24"/>
-              </w:rPr>
-              <w:t xml:space="preserve">Modelo EMD de las unidades 49 y 50 </w:t>
-            </w:r>
-            <w:r>
-              <w:br/>
-            </w:r>
-            <w:r>
-              <w:rPr>
-                <w:rFonts w:ascii="Anthropic Sans Print" w:hAnsi="Anthropic Sans Print" w:eastAsia="Anthropic Sans Print"/>
-                <w:b w:val="0"/>
-                <w:i w:val="0"/>
-                <w:color w:val="1F1E1D"/>
-                <w:sz w:val="24"/>
-              </w:rPr>
-              <w:t xml:space="preserve">Inventario real de luminarias y potencia de las ampolletas actuales </w:t>
-            </w:r>
-            <w:r>
-              <w:br/>
-            </w:r>
             <w:r>
               <w:rPr>
                 <w:rFonts w:ascii="Anthropic Sans Print" w:hAnsi="Anthropic Sans Print" w:eastAsia="Anthropic Sans Print"/>
@@ -24115,7 +24192,7 @@
                     <pic:cNvPicPr/>
                   </pic:nvPicPr>
                   <pic:blipFill>
-                    <a:blip r:embed="rId17"/>
+                    <a:blip r:embed="rId18"/>
                     <a:stretch>
                       <a:fillRect/>
                     </a:stretch>
@@ -24200,7 +24277,7 @@
                     <pic:cNvPicPr/>
                   </pic:nvPicPr>
                   <pic:blipFill>
-                    <a:blip r:embed="rId17"/>
+                    <a:blip r:embed="rId18"/>
                     <a:stretch>
                       <a:fillRect/>
                     </a:stretch>
@@ -24285,7 +24362,7 @@
                     <pic:cNvPicPr/>
                   </pic:nvPicPr>
                   <pic:blipFill>
-                    <a:blip r:embed="rId17"/>
+                    <a:blip r:embed="rId18"/>
                     <a:stretch>
                       <a:fillRect/>
                     </a:stretch>
@@ -24345,94 +24422,9 @@
     <w:p>
       <w:pPr>
         <w:autoSpaceDN w:val="0"/>
-        <w:tabs>
-          <w:tab w:pos="516" w:val="left"/>
-        </w:tabs>
         <w:autoSpaceDE w:val="0"/>
         <w:widowControl/>
-        <w:spacing w:line="240" w:lineRule="auto" w:before="120" w:after="0"/>
-        <w:ind w:left="240" w:right="720" w:firstLine="0"/>
-        <w:jc w:val="left"/>
-      </w:pPr>
-      <w:r>
-        <w:drawing>
-          <wp:inline xmlns:a="http://schemas.openxmlformats.org/drawingml/2006/main" xmlns:pic="http://schemas.openxmlformats.org/drawingml/2006/picture">
-            <wp:extent cx="63500" cy="63500"/>
-            <wp:docPr id="43" name="Picture 43"/>
-            <wp:cNvGraphicFramePr>
-              <a:graphicFrameLocks noChangeAspect="1"/>
-            </wp:cNvGraphicFramePr>
-            <a:graphic>
-              <a:graphicData uri="http://schemas.openxmlformats.org/drawingml/2006/picture">
-                <pic:pic>
-                  <pic:nvPicPr>
-                    <pic:cNvPr id="0" name="image.png"/>
-                    <pic:cNvPicPr/>
-                  </pic:nvPicPr>
-                  <pic:blipFill>
-                    <a:blip r:embed="rId17"/>
-                    <a:stretch>
-                      <a:fillRect/>
-                    </a:stretch>
-                  </pic:blipFill>
-                  <pic:spPr>
-                    <a:xfrm>
-                      <a:off x="0" y="0"/>
-                      <a:ext cx="63500" cy="63500"/>
-                    </a:xfrm>
-                    <a:prstGeom prst="rect"/>
-                  </pic:spPr>
-                </pic:pic>
-              </a:graphicData>
-            </a:graphic>
-          </wp:inline>
-        </w:drawing>
-      </w:r>
-      <w:r>
-        <w:rPr>
-          <w:u w:val="single" w:color="2978d5"/>
-          <w:rFonts w:ascii="Anthropic Sans Print" w:hAnsi="Anthropic Sans Print" w:eastAsia="Anthropic Sans Print"/>
-          <w:b w:val="0"/>
-          <w:i w:val="0"/>
-          <w:color w:val="2A78D6"/>
-          <w:sz w:val="24"/>
-        </w:rPr>
-        <w:hyperlink r:id="rId25" w:history="1">
-          <w:r>
-            <w:rPr>
-              <w:rStyle w:val="Hyperlink"/>
-            </w:rPr>
-            <w:t>Fórmulas de lámparas incandescentes (ControlBooth)</w:t>
-          </w:r>
-        </w:hyperlink>
-      </w:r>
-      <w:r>
-        <w:rPr>
-          <w:rFonts w:ascii="Anthropic Sans Print" w:hAnsi="Anthropic Sans Print" w:eastAsia="Anthropic Sans Print"/>
-          <w:b w:val="0"/>
-          <w:i w:val="0"/>
-          <w:color w:val="1F1E1D"/>
-          <w:sz w:val="24"/>
-        </w:rPr>
-        <w:t xml:space="preserve">: exponentes de vida y flujo </w:t>
-      </w:r>
-      <w:r>
-        <w:rPr>
-          <w:rFonts w:ascii="Anthropic Sans Print" w:hAnsi="Anthropic Sans Print" w:eastAsia="Anthropic Sans Print"/>
-          <w:b w:val="0"/>
-          <w:i w:val="0"/>
-          <w:color w:val="1F1E1D"/>
-          <w:sz w:val="24"/>
-        </w:rPr>
-        <w:t>luminoso.</w:t>
-      </w:r>
-    </w:p>
-    <w:p>
-      <w:pPr>
-        <w:autoSpaceDN w:val="0"/>
-        <w:autoSpaceDE w:val="0"/>
-        <w:widowControl/>
-        <w:spacing w:line="240" w:lineRule="auto" w:before="876" w:after="0"/>
+        <w:spacing w:line="240" w:lineRule="auto" w:before="1296" w:after="0"/>
         <w:ind w:left="0" w:right="28" w:firstLine="0"/>
         <w:jc w:val="right"/>
       </w:pPr>
@@ -24502,6 +24494,101 @@
         <w:drawing>
           <wp:inline xmlns:a="http://schemas.openxmlformats.org/drawingml/2006/main" xmlns:pic="http://schemas.openxmlformats.org/drawingml/2006/picture">
             <wp:extent cx="63500" cy="50800"/>
+            <wp:docPr id="43" name="Picture 43"/>
+            <wp:cNvGraphicFramePr>
+              <a:graphicFrameLocks noChangeAspect="1"/>
+            </wp:cNvGraphicFramePr>
+            <a:graphic>
+              <a:graphicData uri="http://schemas.openxmlformats.org/drawingml/2006/picture">
+                <pic:pic>
+                  <pic:nvPicPr>
+                    <pic:cNvPr id="0" name="image.png"/>
+                    <pic:cNvPicPr/>
+                  </pic:nvPicPr>
+                  <pic:blipFill>
+                    <a:blip r:embed="rId12"/>
+                    <a:stretch>
+                      <a:fillRect/>
+                    </a:stretch>
+                  </pic:blipFill>
+                  <pic:spPr>
+                    <a:xfrm>
+                      <a:off x="0" y="0"/>
+                      <a:ext cx="63500" cy="50800"/>
+                    </a:xfrm>
+                    <a:prstGeom prst="rect"/>
+                  </pic:spPr>
+                </pic:pic>
+              </a:graphicData>
+            </a:graphic>
+          </wp:inline>
+        </w:drawing>
+      </w:r>
+      <w:r>
+        <w:rPr>
+          <w:u w:val="single" w:color="2978d5"/>
+          <w:rFonts w:ascii="Anthropic Sans Print" w:hAnsi="Anthropic Sans Print" w:eastAsia="Anthropic Sans Print"/>
+          <w:b w:val="0"/>
+          <w:i w:val="0"/>
+          <w:color w:val="2A78D6"/>
+          <w:sz w:val="24"/>
+        </w:rPr>
+        <w:hyperlink r:id="rId25" w:history="1">
+          <w:r>
+            <w:rPr>
+              <w:rStyle w:val="Hyperlink"/>
+            </w:rPr>
+            <w:t>Fórmulas de lámparas incandescentes (ControlBooth)</w:t>
+          </w:r>
+        </w:hyperlink>
+      </w:r>
+      <w:r>
+        <w:rPr>
+          <w:rFonts w:ascii="Anthropic Sans Print" w:hAnsi="Anthropic Sans Print" w:eastAsia="Anthropic Sans Print"/>
+          <w:b w:val="0"/>
+          <w:i w:val="0"/>
+          <w:color w:val="1F1E1D"/>
+          <w:sz w:val="24"/>
+        </w:rPr>
+        <w:t>: exponentes de vida y flujo</w:t>
+      </w:r>
+    </w:p>
+    <w:p>
+      <w:pPr>
+        <w:autoSpaceDN w:val="0"/>
+        <w:autoSpaceDE w:val="0"/>
+        <w:widowControl/>
+        <w:spacing w:line="240" w:lineRule="auto" w:before="60" w:after="0"/>
+        <w:ind w:left="508" w:right="0" w:firstLine="0"/>
+        <w:jc w:val="left"/>
+      </w:pPr>
+      <w:r>
+        <w:rPr>
+          <w:rFonts w:ascii="Anthropic Sans Print" w:hAnsi="Anthropic Sans Print" w:eastAsia="Anthropic Sans Print"/>
+          <w:b w:val="0"/>
+          <w:i w:val="0"/>
+          <w:color w:val="1F1E1D"/>
+          <w:sz w:val="24"/>
+        </w:rPr>
+        <w:t>luminoso.</w:t>
+      </w:r>
+    </w:p>
+    <w:p>
+      <w:pPr>
+        <w:autoSpaceDN w:val="0"/>
+        <w:tabs>
+          <w:tab w:pos="508" w:val="left"/>
+        </w:tabs>
+        <w:autoSpaceDE w:val="0"/>
+        <w:widowControl/>
+        <w:spacing w:line="240" w:lineRule="auto" w:before="120" w:after="0"/>
+        <w:ind w:left="232" w:right="0" w:firstLine="0"/>
+        <w:jc w:val="left"/>
+      </w:pPr>
+      <w:r>
+        <w:drawing>
+          <wp:inline xmlns:a="http://schemas.openxmlformats.org/drawingml/2006/main" xmlns:pic="http://schemas.openxmlformats.org/drawingml/2006/picture">
+            <wp:extent cx="63500" cy="50800"/>
             <wp:docPr id="44" name="Picture 44"/>
             <wp:cNvGraphicFramePr>
               <a:graphicFrameLocks noChangeAspect="1"/>
@@ -24514,7 +24601,7 @@
                     <pic:cNvPicPr/>
                   </pic:nvPicPr>
                   <pic:blipFill>
-                    <a:blip r:embed="rId11"/>
+                    <a:blip r:embed="rId12"/>
                     <a:stretch>
                       <a:fillRect/>
                     </a:stretch>
@@ -24586,7 +24673,7 @@
         <w:autoSpaceDN w:val="0"/>
         <w:autoSpaceDE w:val="0"/>
         <w:widowControl/>
-        <w:spacing w:line="240" w:lineRule="auto" w:before="13536" w:after="0"/>
+        <w:spacing w:line="240" w:lineRule="auto" w:before="12756" w:after="0"/>
         <w:ind w:left="0" w:right="20" w:firstLine="0"/>
         <w:jc w:val="right"/>
       </w:pPr>

</xml_diff>